<commit_message>
docs(H13): parrafo de uso de native en internals + modelo de excepciones #248 en el manual
- Basic Plus desde dentro: parrafo de Eduardo sobre cuando usar native
  (procesos iterativos/con calculo; llamar a BP normal pierde la
  ganancia y el compilador avisa; plataformas sin AOT caen a
  interpretado), erratas corregidas.
- manual.html seccion 11: sustituida la descripcion pre-#248
  (RuntimeError sintetizado por el emisor) por el modelo real:
  jerarquia Exception en Core, import implicito, excepciones de
  usuario extends Exception, errores nativos como RuntimeError.

Co-Authored-By: Claude Opus 4.8 (1M context) <noreply@anthropic.com>
</commit_message>
<xml_diff>
--- a/docs/Basic Plus desde dentro.docx
+++ b/docs/Basic Plus desde dentro.docx
@@ -813,6 +813,15 @@
       </w:r>
     </w:p>
     <w:p>
+      <w:r>
+        <w:rPr>
+          <w:b w:val="0"/>
+          <w:i w:val="0"/>
+        </w:rPr>
+        <w:t>En principio cualquier función puede ser native. Sin embargo, la idea de estas funciones es reducir el tiempo de ejecución de forma significativa: tiene más sentido usarlas en procesos iterativos y recursivos, con mucho cálculo o mucho proceso. Desde una función native podemos llamar a otras funciones native e incluso a funciones BP normales; ahora bien, en ese caso todo lo ganado en velocidad se perdería al cruzar a las funciones convencionales — el compilador lo detecta y muestra un warning de aviso. Por último, en alguna plataforma no muy madura la función se ejecutará igualmente, pero en modo convencional (interpretado), sin ganancia de tiempo: el bytecode siempre está ahí como red de seguridad.</w:t>
+      </w:r>
+    </w:p>
+    <w:p>
       <w:pPr>
         <w:pStyle w:val="Heading1"/>
       </w:pPr>

</xml_diff>